<commit_message>
Section 1.6 - Risk and challenges updated
</commit_message>
<xml_diff>
--- a/reports/Section1_RisksAndChallenges.docx
+++ b/reports/Section1_RisksAndChallenges.docx
@@ -133,6 +133,50 @@
                 <w:sz w:val="18"/>
               </w:rPr>
               <w:t>Report macro-F1 and per-class precision/recall/F1 rather than accuracy (Section 5); use a class-weighted loss set from the training split only (3.6); treat validation-F (only 21 beats, 3.1) as a coarse pass/fail alarm rather than a metric to optimise; run patient-level error analysis on DS2 (5.5).</w:t>
+            </w:r>
+          </w:p>
+        </w:tc>
+      </w:tr>
+      <w:tr>
+        <w:tc>
+          <w:tcPr>
+            <w:tcW w:w="2880" w:type="dxa"/>
+          </w:tcPr>
+          <w:p>
+            <w:r>
+              <w:rPr>
+                <w:rFonts w:ascii="Times New Roman" w:hAnsi="Times New Roman"/>
+                <w:sz w:val="18"/>
+              </w:rPr>
+              <w:t>S beats look like normal beats and are only separable by when they arrive.</w:t>
+            </w:r>
+          </w:p>
+        </w:tc>
+        <w:tc>
+          <w:tcPr>
+            <w:tcW w:w="2880" w:type="dxa"/>
+          </w:tcPr>
+          <w:p>
+            <w:r>
+              <w:rPr>
+                <w:rFonts w:ascii="Times New Roman" w:hAnsi="Times New Roman"/>
+                <w:sz w:val="18"/>
+              </w:rPr>
+              <w:t>S beats are premature beats that start above the ventricles, so their waveform is almost the same as a normal beat. The main cue is that they come too early. A model that relies on the waveform alone will mistake S for N, and because N is 89.5 % of all beats while S is only 2.8 % (Section 1.5), these errors barely change accuracy but cost S recall. The timing cue is also fragile: it depends on the neighbouring R-peaks being detected correctly, and it is undefined for the first and last beat of a record, which are dropped.</w:t>
+            </w:r>
+          </w:p>
+        </w:tc>
+        <w:tc>
+          <w:tcPr>
+            <w:tcW w:w="2880" w:type="dxa"/>
+          </w:tcPr>
+          <w:p>
+            <w:r>
+              <w:rPr>
+                <w:rFonts w:ascii="Times New Roman" w:hAnsi="Times New Roman"/>
+                <w:sz w:val="18"/>
+              </w:rPr>
+              <w:t>Give the model the three RR intervals (previous, next and the median of the last four gaps) together with the beat window (Section 1.2), so that an early beat can be compared with the patient's recent rhythm. Compare waveform-only against waveform + RR to show that the timing information is what separates S from N. Report per-class S recall and the S to N confusion rather than accuracy (Section 5), use the class-weighted loss (3.6), and include S beats in the patient-level error analysis on DS2 (5.5).</w:t>
             </w:r>
           </w:p>
         </w:tc>

</xml_diff>